<commit_message>
Release v1.42: fix edited-QSO time shift; left-align Name/Comment columns
Fix: editing a QSO and saving could change its recorded date/time. QsoEditViewModel.Load let the
UTC<->Local auto-sync fire before the QSO's UTC offset was loaded, recomputing (and clobbering) the UTC
time with a zero offset; the shifted value was then saved, drifting further on each re-edit. Load now
suppresses the sync while seeding both date fields directly from the stored QSO.

Log grid: Name and Comment columns are now left-aligned instead of centered.

Bumped AppVersion, added the changelog entry, and synced the manual (cover + Appendix A) to 1.42.
Published CvarcLogger.V1.42.zip and CvarcLogger-Setup-1.42.exe.
</commit_message>
<xml_diff>
--- a/docs/CvarcLogger User Manual.docx
+++ b/docs/CvarcLogger User Manual.docx
@@ -94,7 +94,7 @@
           <w:i/>
           <w:sz w:val="24"/>
         </w:rPr>
-        <w:t>Version 1.41</w:t>
+        <w:t>Version 1.42</w:t>
       </w:r>
     </w:p>
     <w:p>
@@ -3235,7 +3235,7 @@
     </w:p>
     <w:p>
       <w:r>
-        <w:t>Run CvarcLogger.exe. The title bar shows the running version (for example, "CVARC Logger v1.41"). On first launch, a new log database (cvarclogger.db) is created automatically next to the .exe file, so a portable install (for example, run from a USB drive or a synced folder) carries its data with it.</w:t>
+        <w:t>Run CvarcLogger.exe. The title bar shows the running version (for example, "CVARC Logger v1.42"). On first launch, a new log database (cvarclogger.db) is created automatically next to the .exe file, so a portable install (for example, run from a USB drive or a synced folder) carries its data with it.</w:t>
       </w:r>
     </w:p>
     <w:p>
@@ -5639,6 +5639,44 @@
                 <w:sz w:val="20"/>
               </w:rPr>
               <w:t>Highlights</w:t>
+            </w:r>
+          </w:p>
+        </w:tc>
+      </w:tr>
+      <w:tr>
+        <w:tc>
+          <w:tcPr>
+            <w:tcW w:w="4788" w:type="dxa"/>
+          </w:tcPr>
+          <w:p>
+            <w:pPr>
+              <w:rPr>
+                <w:sz w:val="20"/>
+              </w:rPr>
+            </w:pPr>
+            <w:r>
+              <w:rPr>
+                <w:sz w:val="20"/>
+              </w:rPr>
+              <w:t>1.42</w:t>
+            </w:r>
+          </w:p>
+        </w:tc>
+        <w:tc>
+          <w:tcPr>
+            <w:tcW w:w="4788" w:type="dxa"/>
+          </w:tcPr>
+          <w:p>
+            <w:pPr>
+              <w:rPr>
+                <w:sz w:val="20"/>
+              </w:rPr>
+            </w:pPr>
+            <w:r>
+              <w:rPr>
+                <w:sz w:val="20"/>
+              </w:rPr>
+              <w:t>Fixed a bug where editing a QSO could change its recorded date/time. Log grid Name and Comment columns are now left-aligned.</w:t>
             </w:r>
           </w:p>
         </w:tc>

</xml_diff>

<commit_message>
Release v1.46: fix DXCC seed crash on fresh databases
DxccEntity.EntityCode is a natural, app-assigned key, but EF Core's default
convention treats a single unconfigured int PK as database-generated. The
seed data's placeholder "None" entity has EntityCode 0, which EF read as
"unassigned" and let SQLite auto-generate -- colliding with another real
entity's explicit code in the same insert batch and crashing first-launch
seeding with an EntityCode identity-conflict error. Mark EntityCode as
ValueGeneratedNever and add the migration to drop the Autoincrement
annotation on existing databases too. Also guard SeedRunner against the 21
prefixes in the seed data that are legitimately claimed by more than one
entity, since PrefixMapping.Prefix has a unique index.
</commit_message>
<xml_diff>
--- a/docs/CvarcLogger User Manual.docx
+++ b/docs/CvarcLogger User Manual.docx
@@ -3544,6 +3544,38 @@
                 <w:sz w:val="20"/>
               </w:rPr>
               <w:t>Highlights</w:t>
+            </w:r>
+          </w:p>
+        </w:tc>
+      </w:tr>
+      <w:tr>
+        <w:tc>
+          <w:tcPr>
+            <w:tcW w:type="dxa" w:w="4680"/>
+          </w:tcPr>
+          <w:p>
+            <w:r>
+              <w:t>1.46</w:t>
+            </w:r>
+            <w:r>
+              <w:rPr>
+                <w:sz w:val="20"/>
+              </w:rPr>
+            </w:r>
+          </w:p>
+        </w:tc>
+        <w:tc>
+          <w:tcPr>
+            <w:tcW w:type="dxa" w:w="4680"/>
+          </w:tcPr>
+          <w:p>
+            <w:r>
+              <w:t>Fixed a crash seeding the DXCC entity table on a brand-new database.</w:t>
+            </w:r>
+            <w:r>
+              <w:rPr>
+                <w:sz w:val="20"/>
+              </w:rPr>
             </w:r>
           </w:p>
         </w:tc>

</xml_diff>

<commit_message>
Release v2.03: SKCC roster lookup + awards tracking, sortable log column, grid fixes
- SKCC # field resolves live against a downloadable local member roster
- New SKCC tab in Awards Progress (Centurion/Tribune/Senator, computed from
  CW QSOs cross-referenced against official award-date lists)
- Log grid: row number is now a real sortable "#" column
- Log grid: RST/QSL/LoTW columns sortable; corner control is a select-all/
  clear-all toggle
- Entry form: Dupe Check and Lock Fields options
- Manual: K4 -> generic TCP/IP-radio wording, narrower Version History
  Version column, friendlier Introduction/Quick Start
</commit_message>
<xml_diff>
--- a/docs/CvarcLogger User Manual.docx
+++ b/docs/CvarcLogger User Manual.docx
@@ -34,7 +34,7 @@
           <w:b/>
           <w:sz w:val="32"/>
         </w:rPr>
-        <w:t>Version 2.02</w:t>
+        <w:t>Version 2.03</w:t>
       </w:r>
     </w:p>
     <w:p>
@@ -1646,7 +1646,7 @@
           <w:b w:val="0"/>
           <w:i w:val="0"/>
         </w:rPr>
-        <w:t>CVARC Logger is a Windows desktop application for logging amateur radio contacts (QSOs). It is built to handle your everyday, average contacts just as smoothly as specialized activity like contest exchanges, SOTA summit activations, and POTA park activations. The design goal is fast, live, in-the-chair logging: enter a callsign, look it up online, and save the contact in a keystroke or two, while the log grid, awards tracking, and radio integration all update in the background without any extra effort on your part.</w:t>
+        <w:t>CVARC Logger is a Windows desktop application for logging amateur radio contacts (QSOs), built by the Conejo Valley Amateur Radio Club (W6CSM). It is designed for fast, live, in-the-chair logging: whether you're hunting DX, running a high-speed contest, activating a summit or park, or working a club net, the program reshapes itself around how you operate rather than the other way around.</w:t>
       </w:r>
     </w:p>
     <w:p>
@@ -1664,7 +1664,7 @@
           <w:b w:val="0"/>
           <w:i w:val="0"/>
         </w:rPr>
-        <w:t>At a glance, CVARC Logger offers:</w:t>
+        <w:t>Here's a closer look at what CVARC Logger offers:</w:t>
       </w:r>
     </w:p>
     <w:p>
@@ -1672,7 +1672,16 @@
         <w:pStyle w:val="ListBullet"/>
       </w:pPr>
       <w:r>
-        <w:t>Fast QSO entry with automatic online callsign lookup (Callook.info, QRZ.com, and QRZCQ.com).</w:t>
+        <w:rPr>
+          <w:b/>
+        </w:rPr>
+        <w:t xml:space="preserve">Adaptive Logging Modes. </w:t>
+      </w:r>
+      <w:r>
+        <w:rPr>
+          <w:b w:val="0"/>
+        </w:rPr>
+        <w:t>Normal, Contest, SOTA, POTA, and four blank Custom tabs each reshape the entry form to show only the fields that activity needs. Contest mode adds a running Sequence number that auto-increments with each save, along with ARRL Sweepstakes/Field Day fields (Precedence, Check, Class) and SKCC member numbers. The Custom tabs start out blank so you can build and rename your own activity-specific layout -- see Section 4.2.</w:t>
       </w:r>
     </w:p>
     <w:p>
@@ -1680,7 +1689,16 @@
         <w:pStyle w:val="ListBullet"/>
       </w:pPr>
       <w:r>
-        <w:t>Log Modes that reshape the entry form to show only the fields the current activity actually needs, reached from the sidebar's toggle tabs -- see Section 4.2 for exactly how these work.</w:t>
+        <w:rPr>
+          <w:b/>
+        </w:rPr>
+        <w:t xml:space="preserve">A Fully Customizable, Drag-and-Drop Layout. </w:t>
+      </w:r>
+      <w:r>
+        <w:rPr>
+          <w:b w:val="0"/>
+        </w:rPr>
+        <w:t>Click and drag any field to a new spot on the entry form -- drop it on top of another field and that field is bumped aside rather than overwritten. Tab always moves through fields in the order they actually appear on screen, so a custom layout never breaks keyboard navigation -- see Section 4.3.</w:t>
       </w:r>
     </w:p>
     <w:p>
@@ -1688,7 +1706,16 @@
         <w:pStyle w:val="ListBullet"/>
       </w:pPr>
       <w:r>
-        <w:t>A fully customizable entry form: drag any field to a new position, and choose which fields appear at all, independently for each Log Mode.</w:t>
+        <w:rPr>
+          <w:b/>
+        </w:rPr>
+        <w:t xml:space="preserve">“Sticky” Fields. </w:t>
+      </w:r>
+      <w:r>
+        <w:rPr>
+          <w:b w:val="0"/>
+        </w:rPr>
+        <w:t>Twelve core fields (Band, Frequency, Mode, Sub-Mode, RST Sent/Rcvd, Operator, TX Power, My Grid, My State, My SOTA, and My POTA) can each be marked static to hold their value across every saved contact, or left unchecked so they clear themselves automatically after each log -- see Section 4.3.</w:t>
       </w:r>
     </w:p>
     <w:p>
@@ -1696,7 +1723,16 @@
         <w:pStyle w:val="ListBullet"/>
       </w:pPr>
       <w:r>
-        <w:t>Local SOTA and POTA reference databases, so entering a summit or park number shows its name right on the entry form without a round trip to the internet for every contact.</w:t>
+        <w:rPr>
+          <w:b/>
+        </w:rPr>
+        <w:t xml:space="preserve">Automatic Callsign Lookup. </w:t>
+      </w:r>
+      <w:r>
+        <w:rPr>
+          <w:b w:val="0"/>
+        </w:rPr>
+        <w:t>Type a callsign and CVARC Logger queries Callook.info (always available) and, if configured, QRZ.com or QRZCQ.com to fill in the operator's name, grid square, and location -- see Section 4.4.</w:t>
       </w:r>
     </w:p>
     <w:p>
@@ -1704,7 +1740,16 @@
         <w:pStyle w:val="ListBullet"/>
       </w:pPr>
       <w:r>
-        <w:t>Live radio control (CAT) over USB via Hamlib's rigctld, or over the network to an Elecraft K4, auto-filling Frequency, Band, Mode, and TX Power as you tune.</w:t>
+        <w:rPr>
+          <w:b/>
+        </w:rPr>
+        <w:t xml:space="preserve">Local SOTA and POTA Databases. </w:t>
+      </w:r>
+      <w:r>
+        <w:rPr>
+          <w:b w:val="0"/>
+        </w:rPr>
+        <w:t>Download the official summit and park reference rosters once with the refresh button, then typing a reference number shows its name instantly, even with no internet connection in the field -- see Section 4.5.</w:t>
       </w:r>
     </w:p>
     <w:p>
@@ -1712,7 +1757,16 @@
         <w:pStyle w:val="ListBullet"/>
       </w:pPr>
       <w:r>
-        <w:t>Contest logging support: a running Sequence number for the exchange serial, plus ARRL Sweepstakes and Field Day fields (Precedence, Check, Class) and SKCC member numbers.</w:t>
+        <w:rPr>
+          <w:b/>
+        </w:rPr>
+        <w:t xml:space="preserve">Live Radio Control (CAT). </w:t>
+      </w:r>
+      <w:r>
+        <w:rPr>
+          <w:b w:val="0"/>
+        </w:rPr>
+        <w:t>Connect over USB via Hamlib's rigctld, or over the network to an internet TCP/IP capable radio, and CVARC Logger auto-fills Frequency, Band, Mode, and TX Power as you tune -- see Section 4.8.</w:t>
       </w:r>
     </w:p>
     <w:p>
@@ -1720,7 +1774,16 @@
         <w:pStyle w:val="ListBullet"/>
       </w:pPr>
       <w:r>
-        <w:t>Net roll-call markers: a checkbox on every log row lets a net controller track who's already been called on for their statement, so an interruption never loses their place.</w:t>
+        <w:rPr>
+          <w:b/>
+        </w:rPr>
+        <w:t xml:space="preserve">Digital Mode Automation. </w:t>
+      </w:r>
+      <w:r>
+        <w:rPr>
+          <w:b w:val="0"/>
+        </w:rPr>
+        <w:t>Contacts logged in WSJT-X are relayed through GridTracker2 over UDP and captured automatically, with QSOs also broadcast back out to GridTracker2 for live mapping -- see Section 10.4.</w:t>
       </w:r>
     </w:p>
     <w:p>
@@ -1728,7 +1791,16 @@
         <w:pStyle w:val="ListBullet"/>
       </w:pPr>
       <w:r>
-        <w:t>Multiple station profiles, so different callsigns, grid squares, or operating locations each keep their own settings.</w:t>
+        <w:rPr>
+          <w:b/>
+        </w:rPr>
+        <w:t xml:space="preserve">Net Roll-Call Markers. </w:t>
+      </w:r>
+      <w:r>
+        <w:rPr>
+          <w:b w:val="0"/>
+        </w:rPr>
+        <w:t>A checkbox on every log row lets a net controller track who's already been called on for their statement, so an interruption never loses their place -- see Section 5.7.</w:t>
       </w:r>
     </w:p>
     <w:p>
@@ -1736,7 +1808,16 @@
         <w:pStyle w:val="ListBullet"/>
       </w:pPr>
       <w:r>
-        <w:t>A searchable, sortable, and fully customizable QSO log grid with multi-select, bulk delete, and copy/paste to and from a spreadsheet.</w:t>
+        <w:rPr>
+          <w:b/>
+        </w:rPr>
+        <w:t xml:space="preserve">A Powerful Log Grid. </w:t>
+      </w:r>
+      <w:r>
+        <w:rPr>
+          <w:b w:val="0"/>
+        </w:rPr>
+        <w:t>Search, sort, and reorder columns; multi-select rows for bulk delete; and copy/paste directly to and from a spreadsheet -- see Section 5.</w:t>
       </w:r>
     </w:p>
     <w:p>
@@ -1744,7 +1825,16 @@
         <w:pStyle w:val="ListBullet"/>
       </w:pPr>
       <w:r>
-        <w:t>ADIF import and export, compatible with QRZ Logbook, LoTW, and virtually every other logging program.</w:t>
+        <w:rPr>
+          <w:b/>
+        </w:rPr>
+        <w:t xml:space="preserve">Multiple Station Profiles and Log Files. </w:t>
+      </w:r>
+      <w:r>
+        <w:rPr>
+          <w:b w:val="0"/>
+        </w:rPr>
+        <w:t>Keep separate callsigns, grid squares, or operating locations each with their own settings, and maintain entirely separate log files for different callsigns, contests, or locations -- see Sections 3 and 9.</w:t>
       </w:r>
     </w:p>
     <w:p>
@@ -1752,23 +1842,16 @@
         <w:pStyle w:val="ListBullet"/>
       </w:pPr>
       <w:r>
-        <w:t>Award progress tracking for DXCC, Worked All States (WAS), Mountain Goat (SOTA), and Parks on the Air (POTA), computed automatically from your log.</w:t>
+        <w:rPr>
+          <w:b/>
+        </w:rPr>
+        <w:t xml:space="preserve">ADIF Import/Export and Award Tracking. </w:t>
       </w:r>
-    </w:p>
-    <w:p>
-      <w:pPr>
-        <w:pStyle w:val="ListBullet"/>
-      </w:pPr>
       <w:r>
-        <w:t>Automatic QSO capture from WSJT-X (relayed through GridTracker2 over UDP), and real-time QSO broadcast out to GridTracker2 for live mapping.</w:t>
-      </w:r>
-    </w:p>
-    <w:p>
-      <w:pPr>
-        <w:pStyle w:val="ListBullet"/>
-      </w:pPr>
-      <w:r>
-        <w:t>Support for multiple independent log files, so you can keep separate logs for different callsigns, contests, or operating locations.</w:t>
+        <w:rPr>
+          <w:b w:val="0"/>
+        </w:rPr>
+        <w:t>Import and export logs compatible with QRZ Logbook, LoTW, and virtually every other logging program, with automatic progress tracking for DXCC, Worked All States (WAS), Mountain Goat (SOTA), and Parks on the Air (POTA) -- see Sections 7 and 8.</w:t>
       </w:r>
     </w:p>
     <w:p>
@@ -2018,7 +2101,7 @@
         <w:ind w:left="360" w:hanging="360"/>
       </w:pPr>
       <w:r>
-        <w:t>1. Open Station Profiles (sidebar) and confirm your callsign, grid square, and UTC offset are set.</w:t>
+        <w:t>1. Set up your identity: open Station Profiles (sidebar) and confirm your callsign, grid square, and UTC offset are set.</w:t>
       </w:r>
     </w:p>
     <w:p>
@@ -2026,7 +2109,7 @@
         <w:ind w:left="360" w:hanging="360"/>
       </w:pPr>
       <w:r>
-        <w:t>2. Type a callsign into the Callsign field on the entry form.</w:t>
+        <w:t>2. Type the callsign: click into the Callsign field on the entry form and type the station you're contacting.</w:t>
       </w:r>
     </w:p>
     <w:p>
@@ -2034,7 +2117,7 @@
         <w:ind w:left="360" w:hanging="360"/>
       </w:pPr>
       <w:r>
-        <w:t>3. Click Call Lookup (or just keep typing -- Log QSO runs a lookup automatically if you haven't clicked Lookup yet) to pull in the contact's name, grid, and location.</w:t>
+        <w:t>3. Trigger the lookup: click Call Lookup, or just keep typing -- Log QSO runs a lookup automatically if you haven't clicked Lookup yet -- to pull in the operator's name, grid, and location.</w:t>
       </w:r>
     </w:p>
     <w:p>
@@ -2042,7 +2125,7 @@
         <w:ind w:left="360" w:hanging="360"/>
       </w:pPr>
       <w:r>
-        <w:t>4. Fill in RST, and any other fields you want for this QSO.</w:t>
+        <w:t>4. Log the exchange: confirm the frequency/band and fill in the signal report (RST Sent/Received) and any other fields you want for this QSO.</w:t>
       </w:r>
     </w:p>
     <w:p>
@@ -2050,7 +2133,7 @@
         <w:ind w:left="360" w:hanging="360"/>
       </w:pPr>
       <w:r>
-        <w:t>5. Press Enter while still in the Callsign field, or click Log QSO, to save the contact. It appears immediately at the top of the QSO Log Grid.</w:t>
+        <w:t>5. Save the QSO: press Enter while still in the Callsign field, or click Log QSO. The contact appears immediately at the top of the QSO Log Grid.</w:t>
       </w:r>
     </w:p>
     <w:p>
@@ -2845,7 +2928,7 @@
           <w:b w:val="0"/>
           <w:i w:val="0"/>
         </w:rPr>
-        <w:t>Connect the CAT button (action ribbon) connects or disconnects live radio control, which auto-fills Frequency, Band, Mode, Sub-Mode, and TX Power as you tune. A status indicator next to the button shows whether CAT is currently connected. Configure which radio and connection method to use under CAT (sidebar) -- see Section 10.2 for the two available sources, USB (Hamlib) and Internet (Elecraft K4).</w:t>
+        <w:t>Connect the CAT button (action ribbon) connects or disconnects live radio control, which auto-fills Frequency, Band, Mode, Sub-Mode, and TX Power as you tune. A status indicator next to the button shows whether CAT is currently connected. Configure which radio and connection method to use under CAT (sidebar) -- see Section 10.2 for the two available sources, USB (Hamlib) and Internet (TCP/IP capable radios).</w:t>
       </w:r>
     </w:p>
     <w:p>
@@ -3673,7 +3756,7 @@
         <w:pStyle w:val="Heading3"/>
       </w:pPr>
       <w:r>
-        <w:t>Internet Control (Elecraft K4)</w:t>
+        <w:t>Internet Control (TCP/IP Capable Radios)</w:t>
       </w:r>
     </w:p>
     <w:p>
@@ -3682,7 +3765,7 @@
           <w:b w:val="0"/>
           <w:i w:val="0"/>
         </w:rPr>
-        <w:t>Reads frequency, band, mode, sub-mode, and TX power from an Elecraft K4 over the network, using its native TCP command protocol (default port 9200). Enter the K4's host/IP, port, and an optional (encrypted) password.</w:t>
+        <w:t>Reads frequency, band, mode, sub-mode, and TX power from an internet TCP/IP capable radio over the network, using its native TCP command protocol (default port 9200). Enter the radio's host/IP, port, and an optional (encrypted) password.</w:t>
       </w:r>
     </w:p>
     <w:p>
@@ -4228,15 +4311,16 @@
         <w:tblW w:type="auto" w:w="0"/>
         <w:jc w:val="center"/>
         <w:tblLook w:firstColumn="1" w:firstRow="1" w:lastColumn="0" w:lastRow="0" w:noHBand="0" w:noVBand="1" w:val="04A0"/>
+        <w:tblLayout w:type="fixed"/>
       </w:tblPr>
       <w:tblGrid>
-        <w:gridCol w:w="4320"/>
-        <w:gridCol w:w="4320"/>
+        <w:gridCol w:w="720"/>
+        <w:gridCol w:w="7920"/>
       </w:tblGrid>
       <w:tr>
         <w:tc>
           <w:tcPr>
-            <w:tcW w:type="dxa" w:w="4320"/>
+            <w:tcW w:type="dxa" w:w="720"/>
           </w:tcPr>
           <w:p>
             <w:r>
@@ -4249,7 +4333,7 @@
         </w:tc>
         <w:tc>
           <w:tcPr>
-            <w:tcW w:type="dxa" w:w="4320"/>
+            <w:tcW w:type="dxa" w:w="7920"/>
           </w:tcPr>
           <w:p>
             <w:r>
@@ -4264,21 +4348,21 @@
       <w:tr>
         <w:tc>
           <w:tcPr>
-            <w:tcW w:type="dxa" w:w="4320"/>
+            <w:tcW w:type="dxa" w:w="720"/>
           </w:tcPr>
           <w:p>
             <w:r>
-              <w:t>2.02</w:t>
+              <w:t>2.03</w:t>
             </w:r>
           </w:p>
         </w:tc>
         <w:tc>
           <w:tcPr>
-            <w:tcW w:type="dxa" w:w="4320"/>
+            <w:tcW w:type="dxa" w:w="7920"/>
           </w:tcPr>
           <w:p>
             <w:r>
-              <w:t>Net roll-call markers: a checkbox on every log row lets a net controller track who's already been called on, with a Clear Net Markers button to reset for the next net. Sidebar rebuilt around toggle tabs -- Normal/Contest and SOTA/POTA now share one button each (click again to flip between the two), plus two new fully customizable Undef-1..4 tabs, renameable and configurable in the Columns/Tabs window like every other mode. “Columns” renamed to “Columns/Tabs” throughout. Rename Tab dialog now sizes itself to its content so its Save/Cancel buttons can't get clipped. Sidebar toggle tab labels now update live when renamed.</w:t>
+              <w:t>SKCC # live roster lookup + new SKCC Awards tab (Centurion/Tribune/Senator tracking); sortable log-number column; RST/QSL/LoTW column sorting fixed; select-all/clear toggle on the log grid corner; Dupe Check and Lock Fields entry-form options.</w:t>
             </w:r>
           </w:p>
         </w:tc>
@@ -4286,21 +4370,21 @@
       <w:tr>
         <w:tc>
           <w:tcPr>
-            <w:tcW w:type="dxa" w:w="4320"/>
+            <w:tcW w:type="dxa" w:w="720"/>
           </w:tcPr>
           <w:p>
             <w:r>
-              <w:t>2.01</w:t>
+              <w:t>2.02</w:t>
             </w:r>
           </w:p>
         </w:tc>
         <w:tc>
           <w:tcPr>
-            <w:tcW w:type="dxa" w:w="4320"/>
+            <w:tcW w:type="dxa" w:w="7920"/>
           </w:tcPr>
           <w:p>
             <w:r>
-              <w:t>Entry form widened from 5 to 6 fields per row. The Delete button (bulk-delete from the log grid) restored to the action ribbon after being lost in an earlier redesign. Tab order fixed a second time (the field's actual on-screen position is now guaranteed to drive Tab order). Enter now logs the QSO from anywhere on the form, not just the Callsign field. Field drag-and-drop can start from anywhere on a field, including its input box, not just the label. Edit QSO's Callsign field no longer forces capital letters while typing. Comment field explicitly left-aligned. Log grid gained a “Station Log” title and pale-blue column headers. Awards window grids gained alternating row shading. Banner gained a club-name subtitle.</w:t>
+              <w:t>Net roll-call markers: a checkbox on every log row lets a net controller track who's already been called on, with a Clear Net Markers button to reset for the next net. Sidebar rebuilt around toggle tabs -- Normal/Contest and SOTA/POTA now share one button each (click again to flip between the two), plus two new fully customizable Undef-1..4 tabs, renameable and configurable in the Columns/Tabs window like every other mode. “Columns” renamed to “Columns/Tabs” throughout. Rename Tab dialog now sizes itself to its content so its Save/Cancel buttons can't get clipped. Sidebar toggle tab labels now update live when renamed.</w:t>
             </w:r>
           </w:p>
         </w:tc>
@@ -4308,21 +4392,21 @@
       <w:tr>
         <w:tc>
           <w:tcPr>
-            <w:tcW w:type="dxa" w:w="4320"/>
+            <w:tcW w:type="dxa" w:w="720"/>
           </w:tcPr>
           <w:p>
             <w:r>
-              <w:t>2.0</w:t>
+              <w:t>2.01</w:t>
             </w:r>
           </w:p>
         </w:tc>
         <w:tc>
           <w:tcPr>
-            <w:tcW w:type="dxa" w:w="4320"/>
+            <w:tcW w:type="dxa" w:w="7920"/>
           </w:tcPr>
           <w:p>
             <w:r>
-              <w:t>Customizable entry form: fields can be dragged to any position and shown/hidden independently per Log Mode, with renameable mode tabs in the Column Visibility picker. Per-field “static” checkboxes replace the old fixed sticky-field list. Local SOTA/POTA reference databases show summit/park names right on the entry form. QSO log grid gained a live search box. Tooltips added throughout. Fixed Tab order to follow a field's actual on-screen position, and Enter-to-log to always use the just-typed callsign. Edit QSO window restyled to match the rest of the program, with a clearer focus highlight. Locked-in UI sizing rules for Rows 1-3 of the entry form. Startup check for Hamlib with an on-demand install link.</w:t>
+              <w:t>Entry form widened from 5 to 6 fields per row. The Delete button (bulk-delete from the log grid) restored to the action ribbon after being lost in an earlier redesign. Tab order fixed a second time (the field's actual on-screen position is now guaranteed to drive Tab order). Enter now logs the QSO from anywhere on the form, not just the Callsign field. Field drag-and-drop can start from anywhere on a field, including its input box, not just the label. Edit QSO's Callsign field no longer forces capital letters while typing. Comment field explicitly left-aligned. Log grid gained a “Station Log” title and pale-blue column headers. Awards window grids gained alternating row shading. Banner gained a club-name subtitle.</w:t>
             </w:r>
           </w:p>
         </w:tc>
@@ -4330,21 +4414,21 @@
       <w:tr>
         <w:tc>
           <w:tcPr>
-            <w:tcW w:type="dxa" w:w="4320"/>
+            <w:tcW w:type="dxa" w:w="720"/>
           </w:tcPr>
           <w:p>
             <w:r>
-              <w:t>1.48</w:t>
+              <w:t>2.0</w:t>
             </w:r>
           </w:p>
         </w:tc>
         <w:tc>
           <w:tcPr>
-            <w:tcW w:type="dxa" w:w="4320"/>
+            <w:tcW w:type="dxa" w:w="7920"/>
           </w:tcPr>
           <w:p>
             <w:r>
-              <w:t>Startup check for Hamlib (rigctld): if not found, offers to open the Hamlib download page so it can be installed on demand. CAT control requires Hamlib; manual logging works without it either way.</w:t>
+              <w:t>Customizable entry form: fields can be dragged to any position and shown/hidden independently per Log Mode, with renameable mode tabs in the Column Visibility picker. Per-field “static” checkboxes replace the old fixed sticky-field list. Local SOTA/POTA reference databases show summit/park names right on the entry form. QSO log grid gained a live search box. Tooltips added throughout. Fixed Tab order to follow a field's actual on-screen position, and Enter-to-log to always use the just-typed callsign. Edit QSO window restyled to match the rest of the program, with a clearer focus highlight. Locked-in UI sizing rules for Rows 1-3 of the entry form. Startup check for Hamlib with an on-demand install link.</w:t>
             </w:r>
           </w:p>
         </w:tc>
@@ -4352,21 +4436,21 @@
       <w:tr>
         <w:tc>
           <w:tcPr>
-            <w:tcW w:type="dxa" w:w="4320"/>
+            <w:tcW w:type="dxa" w:w="720"/>
           </w:tcPr>
           <w:p>
             <w:r>
-              <w:t>1.47</w:t>
+              <w:t>1.48</w:t>
             </w:r>
           </w:p>
         </w:tc>
         <w:tc>
           <w:tcPr>
-            <w:tcW w:type="dxa" w:w="4320"/>
+            <w:tcW w:type="dxa" w:w="7920"/>
           </w:tcPr>
           <w:p>
             <w:r>
-              <w:t>QSO Entry form: isolated the operator/sticky fields (Op, QTH, My SKCC #, My SOTA, My POTA, TX Power) into their own row between CAT controls and the action buttons.</w:t>
+              <w:t>Startup check for Hamlib (rigctld): if not found, offers to open the Hamlib download page so it can be installed on demand. CAT control requires Hamlib; manual logging works without it either way.</w:t>
             </w:r>
           </w:p>
         </w:tc>
@@ -4374,21 +4458,21 @@
       <w:tr>
         <w:tc>
           <w:tcPr>
-            <w:tcW w:type="dxa" w:w="4320"/>
+            <w:tcW w:type="dxa" w:w="720"/>
           </w:tcPr>
           <w:p>
             <w:r>
-              <w:t>1.46</w:t>
+              <w:t>1.47</w:t>
             </w:r>
           </w:p>
         </w:tc>
         <w:tc>
           <w:tcPr>
-            <w:tcW w:type="dxa" w:w="4320"/>
+            <w:tcW w:type="dxa" w:w="7920"/>
           </w:tcPr>
           <w:p>
             <w:r>
-              <w:t>Fixed a crash seeding the DXCC entity table on a brand-new database.</w:t>
+              <w:t>QSO Entry form: isolated the operator/sticky fields (Op, QTH, My SKCC #, My SOTA, My POTA, TX Power) into their own row between CAT controls and the action buttons.</w:t>
             </w:r>
           </w:p>
         </w:tc>
@@ -4396,21 +4480,21 @@
       <w:tr>
         <w:tc>
           <w:tcPr>
-            <w:tcW w:type="dxa" w:w="4320"/>
+            <w:tcW w:type="dxa" w:w="720"/>
           </w:tcPr>
           <w:p>
             <w:r>
-              <w:t>1.45</w:t>
+              <w:t>1.46</w:t>
             </w:r>
           </w:p>
         </w:tc>
         <w:tc>
           <w:tcPr>
-            <w:tcW w:type="dxa" w:w="4320"/>
+            <w:tcW w:type="dxa" w:w="7920"/>
           </w:tcPr>
           <w:p>
             <w:r>
-              <w:t>DXCC seed expanded from 72 hand-curated entities to the complete 520-entity official ADIF list, fixing ADIF import failures on DXCC codes outside the old seed.</w:t>
+              <w:t>Fixed a crash seeding the DXCC entity table on a brand-new database.</w:t>
             </w:r>
           </w:p>
         </w:tc>
@@ -4418,21 +4502,21 @@
       <w:tr>
         <w:tc>
           <w:tcPr>
-            <w:tcW w:type="dxa" w:w="4320"/>
+            <w:tcW w:type="dxa" w:w="720"/>
           </w:tcPr>
           <w:p>
             <w:r>
-              <w:t>1.44</w:t>
+              <w:t>1.45</w:t>
             </w:r>
           </w:p>
         </w:tc>
         <w:tc>
           <w:tcPr>
-            <w:tcW w:type="dxa" w:w="4320"/>
+            <w:tcW w:type="dxa" w:w="7920"/>
           </w:tcPr>
           <w:p>
             <w:r>
-              <w:t>Added a Log Mode preset picker (Normal/Contest/SOTA/POTA) to the QSO Entry form, and a Contest-mode Sequence # field with Start/Reset controls.</w:t>
+              <w:t>DXCC seed expanded from 72 hand-curated entities to the complete 520-entity official ADIF list, fixing ADIF import failures on DXCC codes outside the old seed.</w:t>
             </w:r>
           </w:p>
         </w:tc>
@@ -4440,21 +4524,21 @@
       <w:tr>
         <w:tc>
           <w:tcPr>
-            <w:tcW w:type="dxa" w:w="4320"/>
+            <w:tcW w:type="dxa" w:w="720"/>
           </w:tcPr>
           <w:p>
             <w:r>
-              <w:t>1.43</w:t>
+              <w:t>1.44</w:t>
             </w:r>
           </w:p>
         </w:tc>
         <w:tc>
           <w:tcPr>
-            <w:tcW w:type="dxa" w:w="4320"/>
+            <w:tcW w:type="dxa" w:w="7920"/>
           </w:tcPr>
           <w:p>
             <w:r>
-              <w:t>Added ARRL Sweepstakes/Field Day contest logging (Precedence, Check, Class) and SKCC number support, with a Precedence dropdown showing the full ARRL definition for each category.</w:t>
+              <w:t>Added a Log Mode preset picker (Normal/Contest/SOTA/POTA) to the QSO Entry form, and a Contest-mode Sequence # field with Start/Reset controls.</w:t>
             </w:r>
           </w:p>
         </w:tc>
@@ -4462,21 +4546,21 @@
       <w:tr>
         <w:tc>
           <w:tcPr>
-            <w:tcW w:type="dxa" w:w="4320"/>
+            <w:tcW w:type="dxa" w:w="720"/>
           </w:tcPr>
           <w:p>
             <w:r>
-              <w:t>1.42</w:t>
+              <w:t>1.43</w:t>
             </w:r>
           </w:p>
         </w:tc>
         <w:tc>
           <w:tcPr>
-            <w:tcW w:type="dxa" w:w="4320"/>
+            <w:tcW w:type="dxa" w:w="7920"/>
           </w:tcPr>
           <w:p>
             <w:r>
-              <w:t>Fixed a bug where editing a QSO could change its recorded date/time. Log grid Name and Comment columns are now left-aligned. Enter now saves in the Edit QSO window too.</w:t>
+              <w:t>Added ARRL Sweepstakes/Field Day contest logging (Precedence, Check, Class) and SKCC number support, with a Precedence dropdown showing the full ARRL definition for each category.</w:t>
             </w:r>
           </w:p>
         </w:tc>
@@ -4484,21 +4568,21 @@
       <w:tr>
         <w:tc>
           <w:tcPr>
-            <w:tcW w:type="dxa" w:w="4320"/>
+            <w:tcW w:type="dxa" w:w="720"/>
           </w:tcPr>
           <w:p>
             <w:r>
-              <w:t>1.41</w:t>
+              <w:t>1.42</w:t>
             </w:r>
           </w:p>
         </w:tc>
         <w:tc>
           <w:tcPr>
-            <w:tcW w:type="dxa" w:w="4320"/>
+            <w:tcW w:type="dxa" w:w="7920"/>
           </w:tcPr>
           <w:p>
             <w:r>
-              <w:t>Frequency carries over between QSOs; added a Clear Database button; clearer cursor/selection highlighting; ADIF exports named after the log plus a date/time stamp.</w:t>
+              <w:t>Fixed a bug where editing a QSO could change its recorded date/time. Log grid Name and Comment columns are now left-aligned. Enter now saves in the Edit QSO window too.</w:t>
             </w:r>
           </w:p>
         </w:tc>
@@ -4506,21 +4590,21 @@
       <w:tr>
         <w:tc>
           <w:tcPr>
-            <w:tcW w:type="dxa" w:w="4320"/>
+            <w:tcW w:type="dxa" w:w="720"/>
           </w:tcPr>
           <w:p>
             <w:r>
-              <w:t>1.40</w:t>
+              <w:t>1.41</w:t>
             </w:r>
           </w:p>
         </w:tc>
         <w:tc>
           <w:tcPr>
-            <w:tcW w:type="dxa" w:w="4320"/>
+            <w:tcW w:type="dxa" w:w="7920"/>
           </w:tcPr>
           <w:p>
             <w:r>
-              <w:t>Internet Control (CAT) for a networked Elecraft K4. One CAT Source selector (Off/USB/Internet) with a single Save and Test button. Fixed-row entry form layout. Installer offers Update vs. Fresh install.</w:t>
+              <w:t>Frequency carries over between QSOs; added a Clear Database button; clearer cursor/selection highlighting; ADIF exports named after the log plus a date/time stamp.</w:t>
             </w:r>
           </w:p>
         </w:tc>
@@ -4528,21 +4612,21 @@
       <w:tr>
         <w:tc>
           <w:tcPr>
-            <w:tcW w:type="dxa" w:w="4320"/>
+            <w:tcW w:type="dxa" w:w="720"/>
           </w:tcPr>
           <w:p>
             <w:r>
-              <w:t>1.39</w:t>
+              <w:t>1.40</w:t>
             </w:r>
           </w:p>
         </w:tc>
         <w:tc>
           <w:tcPr>
-            <w:tcW w:type="dxa" w:w="4320"/>
+            <w:tcW w:type="dxa" w:w="7920"/>
           </w:tcPr>
           <w:p>
             <w:r>
-              <w:t>Settings split into separate Lookup and CAT Control windows. Enlarged, fixed-row entry form with a tinted background.</w:t>
+              <w:t>Internet Control (CAT) for a networked internet TCP/IP capable radio. One CAT Source selector (Off/USB/Internet) with a single Save and Test button. Fixed-row entry form layout. Installer offers Update vs. Fresh install.</w:t>
             </w:r>
           </w:p>
         </w:tc>
@@ -4550,21 +4634,21 @@
       <w:tr>
         <w:tc>
           <w:tcPr>
-            <w:tcW w:type="dxa" w:w="4320"/>
+            <w:tcW w:type="dxa" w:w="720"/>
           </w:tcPr>
           <w:p>
             <w:r>
-              <w:t>1.38</w:t>
+              <w:t>1.39</w:t>
             </w:r>
           </w:p>
         </w:tc>
         <w:tc>
           <w:tcPr>
-            <w:tcW w:type="dxa" w:w="4320"/>
+            <w:tcW w:type="dxa" w:w="7920"/>
           </w:tcPr>
           <w:p>
             <w:r>
-              <w:t>Log grid: manual column resize, centered headers/data with divider lines and narrower columns. Added Time Off (UTC) field, centered field captions.</w:t>
+              <w:t>Settings split into separate Lookup and CAT Control windows. Enlarged, fixed-row entry form with a tinted background.</w:t>
             </w:r>
           </w:p>
         </w:tc>
@@ -4572,21 +4656,21 @@
       <w:tr>
         <w:tc>
           <w:tcPr>
-            <w:tcW w:type="dxa" w:w="4320"/>
+            <w:tcW w:type="dxa" w:w="720"/>
           </w:tcPr>
           <w:p>
             <w:r>
-              <w:t>1.37</w:t>
+              <w:t>1.38</w:t>
             </w:r>
           </w:p>
         </w:tc>
         <w:tc>
           <w:tcPr>
-            <w:tcW w:type="dxa" w:w="4320"/>
+            <w:tcW w:type="dxa" w:w="7920"/>
           </w:tcPr>
           <w:p>
             <w:r>
-              <w:t>Clarified the Max Power (W)/rigctld manual wording; Station Profile required-field markers; Settings credential status text and Show Password checkboxes.</w:t>
+              <w:t>Log grid: manual column resize, centered headers/data with divider lines and narrower columns. Added Time Off (UTC) field, centered field captions.</w:t>
             </w:r>
           </w:p>
         </w:tc>
@@ -4594,21 +4678,21 @@
       <w:tr>
         <w:tc>
           <w:tcPr>
-            <w:tcW w:type="dxa" w:w="4320"/>
+            <w:tcW w:type="dxa" w:w="720"/>
           </w:tcPr>
           <w:p>
             <w:r>
-              <w:t>1.36</w:t>
+              <w:t>1.37</w:t>
             </w:r>
           </w:p>
         </w:tc>
         <w:tc>
           <w:tcPr>
-            <w:tcW w:type="dxa" w:w="4320"/>
+            <w:tcW w:type="dxa" w:w="7920"/>
           </w:tcPr>
           <w:p>
             <w:r>
-              <w:t>Documented the Max Power (W) calibration field; removed hard page breaks that left large blank gaps between sections.</w:t>
+              <w:t>Clarified the Max Power (W)/rigctld manual wording; Station Profile required-field markers; Settings credential status text and Show Password checkboxes.</w:t>
             </w:r>
           </w:p>
         </w:tc>
@@ -4616,21 +4700,21 @@
       <w:tr>
         <w:tc>
           <w:tcPr>
-            <w:tcW w:type="dxa" w:w="4320"/>
+            <w:tcW w:type="dxa" w:w="720"/>
           </w:tcPr>
           <w:p>
             <w:r>
-              <w:t>1.35</w:t>
+              <w:t>1.36</w:t>
             </w:r>
           </w:p>
         </w:tc>
         <w:tc>
           <w:tcPr>
-            <w:tcW w:type="dxa" w:w="4320"/>
+            <w:tcW w:type="dxa" w:w="7920"/>
           </w:tcPr>
           <w:p>
             <w:r>
-              <w:t>WSJT-X-logged QSOs now get an automatic callsign lookup; log grid row numbers count chronologically (oldest = 1); CAT now auto-fills TX Power (W) too.</w:t>
+              <w:t>Documented the Max Power (W) calibration field; removed hard page breaks that left large blank gaps between sections.</w:t>
             </w:r>
           </w:p>
         </w:tc>
@@ -4638,21 +4722,21 @@
       <w:tr>
         <w:tc>
           <w:tcPr>
-            <w:tcW w:type="dxa" w:w="4320"/>
+            <w:tcW w:type="dxa" w:w="720"/>
           </w:tcPr>
           <w:p>
             <w:r>
-              <w:t>1.34</w:t>
+              <w:t>1.35</w:t>
             </w:r>
           </w:p>
         </w:tc>
         <w:tc>
           <w:tcPr>
-            <w:tcW w:type="dxa" w:w="4320"/>
+            <w:tcW w:type="dxa" w:w="7920"/>
           </w:tcPr>
           <w:p>
             <w:r>
-              <w:t>WSJT-X log receiving now works via GridTracker2's UDP relay (port 2238) instead of competing with GridTracker2 for WSJT-X's own broadcast port.</w:t>
+              <w:t>WSJT-X-logged QSOs now get an automatic callsign lookup; log grid row numbers count chronologically (oldest = 1); CAT now auto-fills TX Power (W) too.</w:t>
             </w:r>
           </w:p>
         </w:tc>
@@ -4660,21 +4744,21 @@
       <w:tr>
         <w:tc>
           <w:tcPr>
-            <w:tcW w:type="dxa" w:w="4320"/>
+            <w:tcW w:type="dxa" w:w="720"/>
           </w:tcPr>
           <w:p>
             <w:r>
-              <w:t>1.33</w:t>
+              <w:t>1.34</w:t>
             </w:r>
           </w:p>
         </w:tc>
         <w:tc>
           <w:tcPr>
-            <w:tcW w:type="dxa" w:w="4320"/>
+            <w:tcW w:type="dxa" w:w="7920"/>
           </w:tcPr>
           <w:p>
             <w:r>
-              <w:t>Mountain Goat (SOTA) points shown as (#) until activated, plus a Summit Name column. New Parks on the Air (POTA) award tab added.</w:t>
+              <w:t>WSJT-X log receiving now works via GridTracker2's UDP relay (port 2238) instead of competing with GridTracker2 for WSJT-X's own broadcast port.</w:t>
             </w:r>
           </w:p>
         </w:tc>
@@ -4682,21 +4766,21 @@
       <w:tr>
         <w:tc>
           <w:tcPr>
-            <w:tcW w:type="dxa" w:w="4320"/>
+            <w:tcW w:type="dxa" w:w="720"/>
           </w:tcPr>
           <w:p>
             <w:r>
-              <w:t>1.32</w:t>
+              <w:t>1.33</w:t>
             </w:r>
           </w:p>
         </w:tc>
         <w:tc>
           <w:tcPr>
-            <w:tcW w:type="dxa" w:w="4320"/>
+            <w:tcW w:type="dxa" w:w="7920"/>
           </w:tcPr>
           <w:p>
             <w:r>
-              <w:t>Requires a station profile on first launch. Mountain Goat (SOTA) award tracking tab with the 4-contact activation rule. WSJT-X direct-UDP QSO receiving added.</w:t>
+              <w:t>Mountain Goat (SOTA) points shown as (#) until activated, plus a Summit Name column. New Parks on the Air (POTA) award tab added.</w:t>
             </w:r>
           </w:p>
         </w:tc>
@@ -4704,21 +4788,21 @@
       <w:tr>
         <w:tc>
           <w:tcPr>
-            <w:tcW w:type="dxa" w:w="4320"/>
+            <w:tcW w:type="dxa" w:w="720"/>
           </w:tcPr>
           <w:p>
             <w:r>
-              <w:t>1.31</w:t>
+              <w:t>1.32</w:t>
             </w:r>
           </w:p>
         </w:tc>
         <w:tc>
           <w:tcPr>
-            <w:tcW w:type="dxa" w:w="4320"/>
+            <w:tcW w:type="dxa" w:w="7920"/>
           </w:tcPr>
           <w:p>
             <w:r>
-              <w:t>QSO entry form's Date/Time (UTC) and Local Time fields tick live once per second while idle; seconds are optional when typing a time by hand.</w:t>
+              <w:t>Requires a station profile on first launch. Mountain Goat (SOTA) award tracking tab with the 4-contact activation rule. WSJT-X direct-UDP QSO receiving added.</w:t>
             </w:r>
           </w:p>
         </w:tc>
@@ -4726,21 +4810,21 @@
       <w:tr>
         <w:tc>
           <w:tcPr>
-            <w:tcW w:type="dxa" w:w="4320"/>
+            <w:tcW w:type="dxa" w:w="720"/>
           </w:tcPr>
           <w:p>
             <w:r>
-              <w:t>1.30</w:t>
+              <w:t>1.31</w:t>
             </w:r>
           </w:p>
         </w:tc>
         <w:tc>
           <w:tcPr>
-            <w:tcW w:type="dxa" w:w="4320"/>
+            <w:tcW w:type="dxa" w:w="7920"/>
           </w:tcPr>
           <w:p>
             <w:r>
-              <w:t>Restored the Comment field to the QSO Entry form; default station profile shown in bold; fixed a startup crash from a missing saved log location.</w:t>
+              <w:t>QSO entry form's Date/Time (UTC) and Local Time fields tick live once per second while idle; seconds are optional when typing a time by hand.</w:t>
             </w:r>
           </w:p>
         </w:tc>
@@ -4748,21 +4832,21 @@
       <w:tr>
         <w:tc>
           <w:tcPr>
-            <w:tcW w:type="dxa" w:w="4320"/>
+            <w:tcW w:type="dxa" w:w="720"/>
           </w:tcPr>
           <w:p>
             <w:r>
-              <w:t>1.29</w:t>
+              <w:t>1.30</w:t>
             </w:r>
           </w:p>
         </w:tc>
         <w:tc>
           <w:tcPr>
-            <w:tcW w:type="dxa" w:w="4320"/>
+            <w:tcW w:type="dxa" w:w="7920"/>
           </w:tcPr>
           <w:p>
             <w:r>
-              <w:t>Entry form, Edit QSO, Settings, and Station Profiles windows now scale with window size; Settings redesigned into two columns.</w:t>
+              <w:t>Restored the Comment field to the QSO Entry form; default station profile shown in bold; fixed a startup crash from a missing saved log location.</w:t>
             </w:r>
           </w:p>
         </w:tc>
@@ -4770,21 +4854,21 @@
       <w:tr>
         <w:tc>
           <w:tcPr>
-            <w:tcW w:type="dxa" w:w="4320"/>
+            <w:tcW w:type="dxa" w:w="720"/>
           </w:tcPr>
           <w:p>
             <w:r>
-              <w:t>1.28</w:t>
+              <w:t>1.29</w:t>
             </w:r>
           </w:p>
         </w:tc>
         <w:tc>
           <w:tcPr>
-            <w:tcW w:type="dxa" w:w="4320"/>
+            <w:tcW w:type="dxa" w:w="7920"/>
           </w:tcPr>
           <w:p>
             <w:r>
-              <w:t>QSO Entry/Edit forms: manual UTC/Local Date-Time entry with sync, SOTA/POTA fields added throughout, reordered/larger entry form. ADIF import/export overhauled for real 3.1.4 compliance.</w:t>
+              <w:t>Entry form, Edit QSO, Settings, and Station Profiles windows now scale with window size; Settings redesigned into two columns.</w:t>
             </w:r>
           </w:p>
         </w:tc>
@@ -4792,21 +4876,21 @@
       <w:tr>
         <w:tc>
           <w:tcPr>
-            <w:tcW w:type="dxa" w:w="4320"/>
+            <w:tcW w:type="dxa" w:w="720"/>
           </w:tcPr>
           <w:p>
             <w:r>
-              <w:t>1.27</w:t>
+              <w:t>1.28</w:t>
             </w:r>
           </w:p>
         </w:tc>
         <w:tc>
           <w:tcPr>
-            <w:tcW w:type="dxa" w:w="4320"/>
+            <w:tcW w:type="dxa" w:w="7920"/>
           </w:tcPr>
           <w:p>
             <w:r>
-              <w:t>Version bump for a fully automated, unattended publish.ps1 run (no app behavior changes).</w:t>
+              <w:t>QSO Entry/Edit forms: manual UTC/Local Date-Time entry with sync, SOTA/POTA fields added throughout, reordered/larger entry form. ADIF import/export overhauled for real 3.1.4 compliance.</w:t>
             </w:r>
           </w:p>
         </w:tc>
@@ -4814,21 +4898,21 @@
       <w:tr>
         <w:tc>
           <w:tcPr>
-            <w:tcW w:type="dxa" w:w="4320"/>
+            <w:tcW w:type="dxa" w:w="720"/>
           </w:tcPr>
           <w:p>
             <w:r>
-              <w:t>1.26</w:t>
+              <w:t>1.27</w:t>
             </w:r>
           </w:p>
         </w:tc>
         <w:tc>
           <w:tcPr>
-            <w:tcW w:type="dxa" w:w="4320"/>
+            <w:tcW w:type="dxa" w:w="7920"/>
           </w:tcPr>
           <w:p>
             <w:r>
-              <w:t>Main window banner now reads “Conejo Valley Amateur Radio Club Logger” instead of “CVARC LOGGER”. publish.ps1 now exports the manual to PDF automatically.</w:t>
+              <w:t>Version bump for a fully automated, unattended publish.ps1 run (no app behavior changes).</w:t>
             </w:r>
           </w:p>
         </w:tc>
@@ -4836,21 +4920,21 @@
       <w:tr>
         <w:tc>
           <w:tcPr>
-            <w:tcW w:type="dxa" w:w="4320"/>
+            <w:tcW w:type="dxa" w:w="720"/>
           </w:tcPr>
           <w:p>
             <w:r>
-              <w:t>1.25</w:t>
+              <w:t>1.26</w:t>
             </w:r>
           </w:p>
         </w:tc>
         <w:tc>
           <w:tcPr>
-            <w:tcW w:type="dxa" w:w="4320"/>
+            <w:tcW w:type="dxa" w:w="7920"/>
           </w:tcPr>
           <w:p>
             <w:r>
-              <w:t>Multi-select QSOs in the log grid (Ctrl/Shift-right-click) with bulk delete; copy/paste QSO rows via Ctrl+C / Ctrl+V.</w:t>
+              <w:t>Main window banner now reads “Conejo Valley Amateur Radio Club Logger” instead of “CVARC LOGGER”. publish.ps1 now exports the manual to PDF automatically.</w:t>
             </w:r>
           </w:p>
         </w:tc>
@@ -4858,21 +4942,21 @@
       <w:tr>
         <w:tc>
           <w:tcPr>
-            <w:tcW w:type="dxa" w:w="4320"/>
+            <w:tcW w:type="dxa" w:w="720"/>
           </w:tcPr>
           <w:p>
             <w:r>
-              <w:t>1.24</w:t>
+              <w:t>1.25</w:t>
             </w:r>
           </w:p>
         </w:tc>
         <w:tc>
           <w:tcPr>
-            <w:tcW w:type="dxa" w:w="4320"/>
+            <w:tcW w:type="dxa" w:w="7920"/>
           </w:tcPr>
           <w:p>
             <w:r>
-              <w:t>ADIF import reads QRZ Logbook's own confirmation fields; larger banner/title; “Program by W6CSM” credit added to the status bar.</w:t>
+              <w:t>Multi-select QSOs in the log grid (Ctrl/Shift-right-click) with bulk delete; copy/paste QSO rows via Ctrl+C / Ctrl+V.</w:t>
             </w:r>
           </w:p>
         </w:tc>
@@ -4880,21 +4964,21 @@
       <w:tr>
         <w:tc>
           <w:tcPr>
-            <w:tcW w:type="dxa" w:w="4320"/>
+            <w:tcW w:type="dxa" w:w="720"/>
           </w:tcPr>
           <w:p>
             <w:r>
-              <w:t>1.23</w:t>
+              <w:t>1.24</w:t>
             </w:r>
           </w:p>
         </w:tc>
         <w:tc>
           <w:tcPr>
-            <w:tcW w:type="dxa" w:w="4320"/>
+            <w:tcW w:type="dxa" w:w="7920"/>
           </w:tcPr>
           <w:p>
             <w:r>
-              <w:t>Fixed a Station Profile double-save crash; ADIF import no longer aborts on unrecognized DXCC codes; merged the duplicate Comment/Notes field pair into one Comment field.</w:t>
+              <w:t>ADIF import reads QRZ Logbook's own confirmation fields; larger banner/title; “Program by W6CSM” credit added to the status bar.</w:t>
             </w:r>
           </w:p>
         </w:tc>
@@ -4902,21 +4986,21 @@
       <w:tr>
         <w:tc>
           <w:tcPr>
-            <w:tcW w:type="dxa" w:w="4320"/>
+            <w:tcW w:type="dxa" w:w="720"/>
           </w:tcPr>
           <w:p>
             <w:r>
-              <w:t>1.20</w:t>
+              <w:t>1.23</w:t>
             </w:r>
           </w:p>
         </w:tc>
         <w:tc>
           <w:tcPr>
-            <w:tcW w:type="dxa" w:w="4320"/>
+            <w:tcW w:type="dxa" w:w="7920"/>
           </w:tcPr>
           <w:p>
             <w:r>
-              <w:t>Row numbers added to the log grid; Enter key now logs a QSO; column order is now draggable and remembered.</w:t>
+              <w:t>Fixed a Station Profile double-save crash; ADIF import no longer aborts on unrecognized DXCC codes; merged the duplicate Comment/Notes field pair into one Comment field.</w:t>
             </w:r>
           </w:p>
         </w:tc>
@@ -4924,21 +5008,21 @@
       <w:tr>
         <w:tc>
           <w:tcPr>
-            <w:tcW w:type="dxa" w:w="4320"/>
+            <w:tcW w:type="dxa" w:w="720"/>
           </w:tcPr>
           <w:p>
             <w:r>
-              <w:t>1.19</w:t>
+              <w:t>1.20</w:t>
             </w:r>
           </w:p>
         </w:tc>
         <w:tc>
           <w:tcPr>
-            <w:tcW w:type="dxa" w:w="4320"/>
+            <w:tcW w:type="dxa" w:w="7920"/>
           </w:tcPr>
           <w:p>
             <w:r>
-              <w:t>App icon and banner logo added.</w:t>
+              <w:t>Row numbers added to the log grid; Enter key now logs a QSO; column order is now draggable and remembered.</w:t>
             </w:r>
           </w:p>
         </w:tc>
@@ -4946,21 +5030,21 @@
       <w:tr>
         <w:tc>
           <w:tcPr>
-            <w:tcW w:type="dxa" w:w="4320"/>
+            <w:tcW w:type="dxa" w:w="720"/>
           </w:tcPr>
           <w:p>
             <w:r>
-              <w:t>1.18</w:t>
+              <w:t>1.19</w:t>
             </w:r>
           </w:p>
         </w:tc>
         <w:tc>
           <w:tcPr>
-            <w:tcW w:type="dxa" w:w="4320"/>
+            <w:tcW w:type="dxa" w:w="7920"/>
           </w:tcPr>
           <w:p>
             <w:r>
-              <w:t>OP field now prefers the station profile's Operator Callsign over its free-text OP name.</w:t>
+              <w:t>App icon and banner logo added.</w:t>
             </w:r>
           </w:p>
         </w:tc>
@@ -4968,17 +5052,39 @@
       <w:tr>
         <w:tc>
           <w:tcPr>
-            <w:tcW w:type="dxa" w:w="4320"/>
+            <w:tcW w:type="dxa" w:w="720"/>
           </w:tcPr>
           <w:p>
             <w:r>
-              <w:t>1.17</w:t>
+              <w:t>1.18</w:t>
             </w:r>
           </w:p>
         </w:tc>
         <w:tc>
           <w:tcPr>
-            <w:tcW w:type="dxa" w:w="4320"/>
+            <w:tcW w:type="dxa" w:w="7920"/>
+          </w:tcPr>
+          <w:p>
+            <w:r>
+              <w:t>OP field now prefers the station profile's Operator Callsign over its free-text OP name.</w:t>
+            </w:r>
+          </w:p>
+        </w:tc>
+      </w:tr>
+      <w:tr>
+        <w:tc>
+          <w:tcPr>
+            <w:tcW w:type="dxa" w:w="720"/>
+          </w:tcPr>
+          <w:p>
+            <w:r>
+              <w:t>1.17</w:t>
+            </w:r>
+          </w:p>
+        </w:tc>
+        <w:tc>
+          <w:tcPr>
+            <w:tcW w:type="dxa" w:w="7920"/>
           </w:tcPr>
           <w:p>
             <w:r>

</xml_diff>

<commit_message>
Release v2.04: DRY/SOLID cleanup and N+1 fix for SKCC awards code
- ReferenceDatabase gains LookupManyAsync: one connection resolves a
  batch of references instead of one connection per lookup
- SkccViewModel.LoadAsync rewritten around it -- 3 database round trips
  total instead of one per unique member (Awards Progress > SKCC tab
  noticeably faster to load on an active SKCC log)
- SKCC roster + Centurion/Tribune/Senator award-list downloaders now
  share SkccPipeDelimitedDatabase/SkccAwardListDatabase base classes
  instead of four near-identical Parse() implementations
- SkccTierStatus.Remaining is now actually shown ("N remaining") instead
  of being computed and never displayed
</commit_message>
<xml_diff>
--- a/docs/CvarcLogger User Manual.docx
+++ b/docs/CvarcLogger User Manual.docx
@@ -34,7 +34,7 @@
           <w:b/>
           <w:sz w:val="32"/>
         </w:rPr>
-        <w:t>Version 2.03</w:t>
+        <w:t>Version 2.04</w:t>
       </w:r>
     </w:p>
     <w:p>
@@ -4352,6 +4352,28 @@
           </w:tcPr>
           <w:p>
             <w:r>
+              <w:t>2.04</w:t>
+            </w:r>
+          </w:p>
+        </w:tc>
+        <w:tc>
+          <w:tcPr>
+            <w:tcW w:type="dxa" w:w="7920"/>
+          </w:tcPr>
+          <w:p>
+            <w:r>
+              <w:t>Internal cleanup and performance work on the SKCC awards feature -- faster SKCC tab load, no user-visible behavior change besides tier labels now showing contacts remaining.</w:t>
+            </w:r>
+          </w:p>
+        </w:tc>
+      </w:tr>
+      <w:tr>
+        <w:tc>
+          <w:tcPr>
+            <w:tcW w:type="dxa" w:w="720"/>
+          </w:tcPr>
+          <w:p>
+            <w:r>
               <w:t>2.03</w:t>
             </w:r>
           </w:p>

</xml_diff>

<commit_message>
Sync manual version history through 2.05, 2.06, and 2.07 (Beta)
The manual's cover page and Appendix A version-history table were
stuck at 2.04. Ran update-manual-version.py for each skipped release
(2.05, 2.06, 2.07 Beta) using the actual CHANGELOG.txt entries, then
regenerated both the PDF and the in-app Help window's JSON manual
from the updated .docx.
</commit_message>
<xml_diff>
--- a/docs/CvarcLogger User Manual.docx
+++ b/docs/CvarcLogger User Manual.docx
@@ -34,7 +34,7 @@
           <w:b/>
           <w:sz w:val="32"/>
         </w:rPr>
-        <w:t>Version 2.04</w:t>
+        <w:t>Version 2.07 (Beta)</w:t>
       </w:r>
     </w:p>
     <w:p>
@@ -4352,6 +4352,72 @@
           </w:tcPr>
           <w:p>
             <w:r>
+              <w:t>2.07 (Beta)</w:t>
+            </w:r>
+          </w:p>
+        </w:tc>
+        <w:tc>
+          <w:tcPr>
+            <w:tcW w:type="dxa" w:w="7920"/>
+          </w:tcPr>
+          <w:p>
+            <w:r>
+              <w:t>New Contests menu with per-contest scoring tools (Field Day, ARRL Sweepstakes, CQ WW, Sprints, NAQP - all labeled Beta). Cabrillo import now saves the full contest header; export dialog auto-fills from the last submission. New in-app Help window with the full manual (including real tables) and find/next search, kept in sync with this document automatically on every build. ARRL Sweepstakes fixes: USB/LSB now count as Phone-event modes, and a Fill in Missing Sections tool backfills ARRL Section from State/County for older QSOs.</w:t>
+            </w:r>
+          </w:p>
+        </w:tc>
+      </w:tr>
+      <w:tr>
+        <w:tc>
+          <w:tcPr>
+            <w:tcW w:type="dxa" w:w="720"/>
+          </w:tcPr>
+          <w:p>
+            <w:r>
+              <w:t>2.06</w:t>
+            </w:r>
+          </w:p>
+        </w:tc>
+        <w:tc>
+          <w:tcPr>
+            <w:tcW w:type="dxa" w:w="7920"/>
+          </w:tcPr>
+          <w:p>
+            <w:r>
+              <w:t>WSJT-X multicast reception as an alternative to GridTracker2 relay. Cabrillo import/export for contest logs. CAT Control: baud rate dropdown, Internet Control radio-type dropdown (K4/FlexRadio/CI-V/Kenwood), USB test now actually polls the radio, rigctld auto-launch on by default. Custom install directory; uninstall prompts to keep or remove the database. Tab key in Callsign now triggers lookup.</w:t>
+            </w:r>
+          </w:p>
+        </w:tc>
+      </w:tr>
+      <w:tr>
+        <w:tc>
+          <w:tcPr>
+            <w:tcW w:type="dxa" w:w="720"/>
+          </w:tcPr>
+          <w:p>
+            <w:r>
+              <w:t>2.05</w:t>
+            </w:r>
+          </w:p>
+        </w:tc>
+        <w:tc>
+          <w:tcPr>
+            <w:tcW w:type="dxa" w:w="7920"/>
+          </w:tcPr>
+          <w:p>
+            <w:r>
+              <w:t>Entry form and log grid can now be resized against each other via a drag handle (remembers your split). Fixed: Edit QSO's Lookup button now works; added a Clear &amp; Lookup button that empties and refetches looked-up fields without touching anything typed by hand.</w:t>
+            </w:r>
+          </w:p>
+        </w:tc>
+      </w:tr>
+      <w:tr>
+        <w:tc>
+          <w:tcPr>
+            <w:tcW w:type="dxa" w:w="720"/>
+          </w:tcPr>
+          <w:p>
+            <w:r>
               <w:t>2.04</w:t>
             </w:r>
           </w:p>

</xml_diff>

<commit_message>
Manual: add page numbers, new Appendix C contest-scoring walkthrough
- Every page now shows "Page X of Y" in the footer (none existed before).
- New Appendix C: Contest Scoring, Step by Step -- plain-language,
  numbered instructions for opening the Contests menu and running each
  scorer (Field Day, Sweepstakes, CQ WW, Sprints, NAQP), plus a full
  SKCC section covering both member-number lookup (edit window, Bulk
  Edit, auto-lookup on log) and the SKCC event scorer, written for a
  non-technical reader.
- Appendix A's version-history table gained the missing 2.07a and 2.08
  rows.
- Title page version stamp corrected from 2.07 to 2.08.
- Table of Contents updated with accurate page numbers throughout.
- Regenerated the manual PDF and the in-app Help window's JSON extract
  to match (now 15 chapters, up from 14).
</commit_message>
<xml_diff>
--- a/docs/CvarcLogger User Manual.docx
+++ b/docs/CvarcLogger User Manual.docx
@@ -34,7 +34,7 @@
           <w:b/>
           <w:sz w:val="32"/>
         </w:rPr>
-        <w:t>Version 2.07 (Beta)</w:t>
+        <w:t>Version 2.08 (Beta)</w:t>
       </w:r>
     </w:p>
     <w:p>
@@ -1596,7 +1596,7 @@
               <w:rPr>
                 <w:sz w:val="18"/>
               </w:rPr>
-              <w:t>27</w:t>
+              <w:t>26</w:t>
             </w:r>
           </w:p>
           <w:p>
@@ -1621,7 +1621,232 @@
               <w:rPr>
                 <w:sz w:val="17"/>
               </w:rPr>
+              <w:t>26</w:t>
+            </w:r>
+          </w:p>
+          <w:p>
+            <w:pPr>
+              <w:tabs>
+                <w:tab w:pos="4248" w:val="right" w:leader="dot"/>
+              </w:tabs>
+              <w:spacing w:after="20"/>
+              <w:ind w:left="0"/>
+            </w:pPr>
+            <w:r>
+              <w:rPr>
+                <w:b/>
+                <w:sz w:val="18"/>
+              </w:rPr>
+              <w:t>Appendix C: Contest Scoring, Step by Step</w:t>
+            </w:r>
+            <w:r>
+              <w:tab/>
+            </w:r>
+            <w:r>
+              <w:rPr>
+                <w:sz w:val="18"/>
+              </w:rPr>
+              <w:t>26</w:t>
+            </w:r>
+          </w:p>
+          <w:p>
+            <w:pPr>
+              <w:tabs>
+                <w:tab w:pos="3960" w:val="right" w:leader="dot"/>
+              </w:tabs>
+              <w:spacing w:after="20"/>
+              <w:ind w:left="288"/>
+            </w:pPr>
+            <w:r>
+              <w:rPr>
+                <w:b w:val="0"/>
+                <w:sz w:val="17"/>
+              </w:rPr>
+              <w:t>C.1 Opening the Contests Menu</w:t>
+            </w:r>
+            <w:r>
+              <w:tab/>
+            </w:r>
+            <w:r>
+              <w:rPr>
+                <w:sz w:val="17"/>
+              </w:rPr>
+              <w:t>26</w:t>
+            </w:r>
+          </w:p>
+          <w:p>
+            <w:pPr>
+              <w:tabs>
+                <w:tab w:pos="3960" w:val="right" w:leader="dot"/>
+              </w:tabs>
+              <w:spacing w:after="20"/>
+              <w:ind w:left="288"/>
+            </w:pPr>
+            <w:r>
+              <w:rPr>
+                <w:b w:val="0"/>
+                <w:sz w:val="17"/>
+              </w:rPr>
+              <w:t>C.2 Field Day</w:t>
+            </w:r>
+            <w:r>
+              <w:tab/>
+            </w:r>
+            <w:r>
+              <w:rPr>
+                <w:sz w:val="17"/>
+              </w:rPr>
+              <w:t>26</w:t>
+            </w:r>
+          </w:p>
+          <w:p>
+            <w:pPr>
+              <w:tabs>
+                <w:tab w:pos="3960" w:val="right" w:leader="dot"/>
+              </w:tabs>
+              <w:spacing w:after="20"/>
+              <w:ind w:left="288"/>
+            </w:pPr>
+            <w:r>
+              <w:rPr>
+                <w:b w:val="0"/>
+                <w:sz w:val="17"/>
+              </w:rPr>
+              <w:t>C.3 ARRL Sweepstakes</w:t>
+            </w:r>
+            <w:r>
+              <w:tab/>
+            </w:r>
+            <w:r>
+              <w:rPr>
+                <w:sz w:val="17"/>
+              </w:rPr>
               <w:t>27</w:t>
+            </w:r>
+          </w:p>
+          <w:p>
+            <w:pPr>
+              <w:tabs>
+                <w:tab w:pos="3960" w:val="right" w:leader="dot"/>
+              </w:tabs>
+              <w:spacing w:after="20"/>
+              <w:ind w:left="288"/>
+            </w:pPr>
+            <w:r>
+              <w:rPr>
+                <w:b w:val="0"/>
+                <w:sz w:val="17"/>
+              </w:rPr>
+              <w:t>C.4 CQ WW DX Contest</w:t>
+            </w:r>
+            <w:r>
+              <w:tab/>
+            </w:r>
+            <w:r>
+              <w:rPr>
+                <w:sz w:val="17"/>
+              </w:rPr>
+              <w:t>27</w:t>
+            </w:r>
+          </w:p>
+          <w:p>
+            <w:pPr>
+              <w:tabs>
+                <w:tab w:pos="3960" w:val="right" w:leader="dot"/>
+              </w:tabs>
+              <w:spacing w:after="20"/>
+              <w:ind w:left="288"/>
+            </w:pPr>
+            <w:r>
+              <w:rPr>
+                <w:b w:val="0"/>
+                <w:sz w:val="17"/>
+              </w:rPr>
+              <w:t>C.5 Sprints</w:t>
+            </w:r>
+            <w:r>
+              <w:tab/>
+            </w:r>
+            <w:r>
+              <w:rPr>
+                <w:sz w:val="17"/>
+              </w:rPr>
+              <w:t>28</w:t>
+            </w:r>
+          </w:p>
+          <w:p>
+            <w:pPr>
+              <w:tabs>
+                <w:tab w:pos="3960" w:val="right" w:leader="dot"/>
+              </w:tabs>
+              <w:spacing w:after="20"/>
+              <w:ind w:left="288"/>
+            </w:pPr>
+            <w:r>
+              <w:rPr>
+                <w:b w:val="0"/>
+                <w:sz w:val="17"/>
+              </w:rPr>
+              <w:t>C.6 NAQP (North American QSO Party)</w:t>
+            </w:r>
+            <w:r>
+              <w:tab/>
+            </w:r>
+            <w:r>
+              <w:rPr>
+                <w:sz w:val="17"/>
+              </w:rPr>
+              <w:t>28</w:t>
+            </w:r>
+          </w:p>
+          <w:p>
+            <w:pPr>
+              <w:tabs>
+                <w:tab w:pos="3960" w:val="right" w:leader="dot"/>
+              </w:tabs>
+              <w:spacing w:after="20"/>
+              <w:ind w:left="288"/>
+            </w:pPr>
+            <w:r>
+              <w:rPr>
+                <w:b w:val="0"/>
+                <w:sz w:val="17"/>
+              </w:rPr>
+              <w:t>C.7 SKCC (Straight Key Century Club)</w:t>
+            </w:r>
+            <w:r>
+              <w:tab/>
+            </w:r>
+            <w:r>
+              <w:rPr>
+                <w:sz w:val="17"/>
+              </w:rPr>
+              <w:t>28</w:t>
+            </w:r>
+          </w:p>
+          <w:p>
+            <w:pPr>
+              <w:tabs>
+                <w:tab w:pos="3960" w:val="right" w:leader="dot"/>
+              </w:tabs>
+              <w:spacing w:after="20"/>
+              <w:ind w:left="288"/>
+            </w:pPr>
+            <w:r>
+              <w:rPr>
+                <w:b w:val="0"/>
+                <w:sz w:val="17"/>
+              </w:rPr>
+              <w:t>C.8 Reading Your Results</w:t>
+            </w:r>
+            <w:r>
+              <w:tab/>
+            </w:r>
+            <w:r>
+              <w:rPr>
+                <w:sz w:val="17"/>
+              </w:rPr>
+              <w:t>29</w:t>
             </w:r>
           </w:p>
         </w:tc>
@@ -4352,6 +4577,50 @@
           </w:tcPr>
           <w:p>
             <w:r>
+              <w:t>2.08 (Beta)</w:t>
+            </w:r>
+          </w:p>
+        </w:tc>
+        <w:tc>
+          <w:tcPr>
+            <w:tcW w:type="dxa" w:w="7920"/>
+          </w:tcPr>
+          <w:p>
+            <w:r>
+              <w:t>SKCC (Straight Key Century Club) support: automatic and manual SKCC # lookup from the local member roster in the QSO edit window, Bulk Edit (“Lookup SKCC # for Selected”), and automatically when logging a QSO. Entry form gained a member tier badge (gold/silver/bronze for Senator/Tribune/Centurion) and a live exchange-preview line next to the SKCC # field. New SKCC scorer under Contests: Weekday Sprint, Weekend Sprintathon, Europe Sprint, Asia Sprint, and QSO Party, scored against SKCC's own published rules. See Appendix C for a full walkthrough.</w:t>
+            </w:r>
+          </w:p>
+        </w:tc>
+      </w:tr>
+      <w:tr>
+        <w:tc>
+          <w:tcPr>
+            <w:tcW w:type="dxa" w:w="720"/>
+          </w:tcPr>
+          <w:p>
+            <w:r>
+              <w:t>2.07a (Beta)</w:t>
+            </w:r>
+          </w:p>
+        </w:tc>
+        <w:tc>
+          <w:tcPr>
+            <w:tcW w:type="dxa" w:w="7920"/>
+          </w:tcPr>
+          <w:p>
+            <w:r>
+              <w:t>Bug-fix release: resolved a crash opening the Field Day scorer; corrected the Field Day Emergency Power bonus to award points per transmitter (not a flat amount) and added the missing GOTA Bonus and GOTA Coach bonuses; fixed invisible typed text in the Field Day bonus count boxes; fixed the Contests menu's Field Day tab not responding the first time the window opened; expanded the DXCC entity list from 338 to 402 entities with CQ/ITU zone data.</w:t>
+            </w:r>
+          </w:p>
+        </w:tc>
+      </w:tr>
+      <w:tr>
+        <w:tc>
+          <w:tcPr>
+            <w:tcW w:type="dxa" w:w="720"/>
+          </w:tcPr>
+          <w:p>
+            <w:r>
               <w:t>2.07 (Beta)</w:t>
             </w:r>
           </w:p>
@@ -5231,7 +5500,404 @@
         <w:t>Thank you to the CVARC members who tested early builds and reported issues throughout development.</w:t>
       </w:r>
     </w:p>
+    <w:p>
+      <w:pPr>
+        <w:pStyle w:val="Heading1"/>
+      </w:pPr>
+      <w:r>
+        <w:t>Appendix C: Contest Scoring, Step by Step</w:t>
+      </w:r>
+    </w:p>
+    <w:p>
+      <w:pPr/>
+      <w:r>
+        <w:t>This appendix walks through every contest scoring tool in CVARC Logger, one step at a time, written for anyone new to contest scoring — not just experienced contesters. If you just want to log QSOs during a contest, see Section 4.7 first; this appendix covers turning a finished log into a score.</w:t>
+      </w:r>
+    </w:p>
+    <w:p>
+      <w:pPr/>
+    </w:p>
+    <w:p>
+      <w:pPr>
+        <w:pStyle w:val="Heading2"/>
+      </w:pPr>
+      <w:r>
+        <w:t>C.1 Opening the Contests Menu</w:t>
+      </w:r>
+    </w:p>
+    <w:p>
+      <w:pPr/>
+      <w:r>
+        <w:t>1. On the sidebar, find the Awards/Contests button.</w:t>
+      </w:r>
+    </w:p>
+    <w:p>
+      <w:pPr/>
+      <w:r>
+        <w:t>2. Click it once to open Awards Progress (Section 7).</w:t>
+      </w:r>
+    </w:p>
+    <w:p>
+      <w:pPr/>
+      <w:r>
+        <w:t>3. Click it a second time (or click it again from the Awards window) to open the Contests menu instead.</w:t>
+      </w:r>
+    </w:p>
+    <w:p>
+      <w:pPr/>
+      <w:r>
+        <w:t>4. The Contests menu has a list of contests down the left side — Field Day, ARRL Sweepstakes, CQ WW, Sprints, NAQP, and SKCC. Click any one of them to see a short description and an “Open Scorer” button.</w:t>
+      </w:r>
+    </w:p>
+    <w:p>
+      <w:pPr/>
+      <w:r>
+        <w:t>5. Click “Open Scorer” to open that contest's own scoring window. Each one works a little differently, covered below.</w:t>
+      </w:r>
+    </w:p>
+    <w:p>
+      <w:pPr/>
+    </w:p>
+    <w:p>
+      <w:pPr/>
+      <w:r>
+        <w:t>A general note before you start: every scoring tool reads your log and calculates a score from it — it does not change or add anything to your log itself. You can recalculate as many times as you like with different settings; nothing is saved until you're ready.</w:t>
+      </w:r>
+    </w:p>
+    <w:p>
+      <w:pPr/>
+    </w:p>
+    <w:p>
+      <w:pPr>
+        <w:pStyle w:val="Heading2"/>
+      </w:pPr>
+      <w:r>
+        <w:t>C.2 Field Day</w:t>
+      </w:r>
+    </w:p>
+    <w:p>
+      <w:pPr/>
+      <w:r>
+        <w:t>1. Open the Field Day scorer (see C.1).</w:t>
+      </w:r>
+    </w:p>
+    <w:p>
+      <w:pPr/>
+      <w:r>
+        <w:t>2. In the Year box, type the year of the Field Day event you're scoring, e.g. 2026.</w:t>
+      </w:r>
+    </w:p>
+    <w:p>
+      <w:pPr/>
+      <w:r>
+        <w:t>3. Choose your Power Class from the dropdown: QRP Battery if you ran 5 watts or less on battery/solar power, Low Power for 150 watts or less, or High Power for anything above that.</w:t>
+      </w:r>
+    </w:p>
+    <w:p>
+      <w:pPr/>
+      <w:r>
+        <w:t>4. If you'd like to double-check which of your logged QSOs actually count for Field Day, click the “Verify Entries” tab at the top — it lists every QSO with a green check or a red note explaining why it doesn't qualify (wrong weekend, missing information, etc.). Go back to the “Score” tab when you're done looking.</w:t>
+      </w:r>
+    </w:p>
+    <w:p>
+      <w:pPr/>
+      <w:r>
+        <w:t>5. On the right side of the Score tab, tick the checkbox next to every bonus you actually earned (Emergency Power, Media Publicity, Safety Officer, and so on). A couple of these — Emergency Power and the GOTA Bonus — also ask how many transmitters or contacts to count; type that number in the small box next to the checkbox.</w:t>
+      </w:r>
+    </w:p>
+    <w:p>
+      <w:pPr/>
+      <w:r>
+        <w:t>6. Click Recalculate. Your full score breakdown appears on the left: QSO points by mode, your power multiplier, bonus points, and the final score.</w:t>
+      </w:r>
+    </w:p>
+    <w:p>
+      <w:pPr/>
+      <w:r>
+        <w:t>7. Click Close when you're done, or change any setting and click Recalculate again.</w:t>
+      </w:r>
+    </w:p>
+    <w:p>
+      <w:pPr/>
+    </w:p>
+    <w:p>
+      <w:pPr>
+        <w:pStyle w:val="Heading2"/>
+      </w:pPr>
+      <w:r>
+        <w:t>C.3 ARRL Sweepstakes</w:t>
+      </w:r>
+    </w:p>
+    <w:p>
+      <w:pPr/>
+      <w:r>
+        <w:t>1. Open the Sweepstakes scorer (see C.1).</w:t>
+      </w:r>
+    </w:p>
+    <w:p>
+      <w:pPr/>
+      <w:r>
+        <w:t>2. Sweepstakes has two separate events — a CW weekend and a Phone (voice) weekend — and the scorer handles both automatically from your log's dates, so there's nothing to select.</w:t>
+      </w:r>
+    </w:p>
+    <w:p>
+      <w:pPr/>
+      <w:r>
+        <w:t>3. If some of your QSOs are missing their ARRL Section (a two- or three-letter code for where the other station is located), click “Fill in Missing Sections” first — it fills them in automatically from the State/County you already logged, wherever it can.</w:t>
+      </w:r>
+    </w:p>
+    <w:p>
+      <w:pPr/>
+      <w:r>
+        <w:t>4. Click Recalculate (or it may calculate automatically when the window opens).</w:t>
+      </w:r>
+    </w:p>
+    <w:p>
+      <w:pPr/>
+      <w:r>
+        <w:t>5. You'll see your CW score and Phone score shown separately, plus a combined total.</w:t>
+      </w:r>
+    </w:p>
+    <w:p>
+      <w:pPr/>
+    </w:p>
+    <w:p>
+      <w:pPr>
+        <w:pStyle w:val="Heading2"/>
+      </w:pPr>
+      <w:r>
+        <w:t>C.4 CQ WW DX Contest</w:t>
+      </w:r>
+    </w:p>
+    <w:p>
+      <w:pPr/>
+      <w:r>
+        <w:t>1. Open the CQ WW scorer (see C.1).</w:t>
+      </w:r>
+    </w:p>
+    <w:p>
+      <w:pPr/>
+      <w:r>
+        <w:t>2. Like Sweepstakes, CQ WW has an SSB (voice) weekend and a CW weekend, and the scorer sorts your QSOs into the right one automatically based on when they happened.</w:t>
+      </w:r>
+    </w:p>
+    <w:p>
+      <w:pPr/>
+      <w:r>
+        <w:t>3. Click Recalculate.</w:t>
+      </w:r>
+    </w:p>
+    <w:p>
+      <w:pPr/>
+      <w:r>
+        <w:t>4. The results show your QSO points (which depend on whether the other station was in your own country, your own continent, a different continent, or elsewhere in North America), your zone and country multipliers, and the final score for each event.</w:t>
+      </w:r>
+    </w:p>
+    <w:p>
+      <w:pPr/>
+    </w:p>
+    <w:p>
+      <w:pPr>
+        <w:pStyle w:val="Heading2"/>
+      </w:pPr>
+      <w:r>
+        <w:t>C.5 Sprints</w:t>
+      </w:r>
+    </w:p>
+    <w:p>
+      <w:pPr/>
+      <w:r>
+        <w:t>1. Open the Sprints scorer (see C.1).</w:t>
+      </w:r>
+    </w:p>
+    <w:p>
+      <w:pPr/>
+      <w:r>
+        <w:t>2. Choose which Sprint you're scoring from the dropdown: CW, SSB, or RTTY Sprint, or the ARRL VHF Contest.</w:t>
+      </w:r>
+    </w:p>
+    <w:p>
+      <w:pPr/>
+      <w:r>
+        <w:t>3. Unlike the other contests, Sprint dates move around and aren't a fixed weekend every time — so type the exact start and end date/time (in UTC) of the specific Sprint you took part in.</w:t>
+      </w:r>
+    </w:p>
+    <w:p>
+      <w:pPr/>
+      <w:r>
+        <w:t>4. Click Recalculate to see your QSO points, multipliers, and final score.</w:t>
+      </w:r>
+    </w:p>
+    <w:p>
+      <w:pPr/>
+    </w:p>
+    <w:p>
+      <w:pPr>
+        <w:pStyle w:val="Heading2"/>
+      </w:pPr>
+      <w:r>
+        <w:t>C.6 NAQP (North American QSO Party)</w:t>
+      </w:r>
+    </w:p>
+    <w:p>
+      <w:pPr/>
+      <w:r>
+        <w:t>1. Open the NAQP scorer (see C.1).</w:t>
+      </w:r>
+    </w:p>
+    <w:p>
+      <w:pPr/>
+      <w:r>
+        <w:t>2. Choose CW, SSB, or RTTY from the dropdown, and type the year in the Year box.</w:t>
+      </w:r>
+    </w:p>
+    <w:p>
+      <w:pPr/>
+      <w:r>
+        <w:t>3. NAQP runs twice a year on fixed weekends; the scorer works out both weekends' dates for you from the year alone, so there's no need to look them up.</w:t>
+      </w:r>
+    </w:p>
+    <w:p>
+      <w:pPr/>
+      <w:r>
+        <w:t>4. Click Recalculate to see your total QSOs, multipliers, and score.</w:t>
+      </w:r>
+    </w:p>
+    <w:p>
+      <w:pPr/>
+    </w:p>
+    <w:p>
+      <w:pPr>
+        <w:pStyle w:val="Heading2"/>
+      </w:pPr>
+      <w:r>
+        <w:t>C.7 SKCC (Straight Key Century Club)</w:t>
+      </w:r>
+    </w:p>
+    <w:p>
+      <w:pPr/>
+      <w:r>
+        <w:t>SKCC support has two parts: looking up other members' SKCC numbers while you log (covered here first), and scoring an SKCC event afterward (covered below).</w:t>
+      </w:r>
+    </w:p>
+    <w:p>
+      <w:pPr/>
+    </w:p>
+    <w:p>
+      <w:pPr/>
+      <w:r>
+        <w:t>Looking up an SKCC number</w:t>
+      </w:r>
+    </w:p>
+    <w:p>
+      <w:pPr/>
+      <w:r>
+        <w:t>1. Before your first SKCC session, download the member list: open the SKCC tab under Awards Progress and use its refresh/update option, or click the small refresh button next to the SKCC # field on the entry form. This only needs to be done occasionally — the list updates itself automatically once a week after that.</w:t>
+      </w:r>
+    </w:p>
+    <w:p>
+      <w:pPr/>
+      <w:r>
+        <w:t>2. While logging live, if you don't already know the other station's SKCC number, just leave the SKCC # field blank and log the QSO as usual — CVARC Logger checks the member list for you automatically and fills it in if they're a member.</w:t>
+      </w:r>
+    </w:p>
+    <w:p>
+      <w:pPr/>
+      <w:r>
+        <w:t>3. To look up a number for a contact you've already logged, open that QSO for editing (Section 6) and click the Lookup button next to the SKCC # field.</w:t>
+      </w:r>
+    </w:p>
+    <w:p>
+      <w:pPr/>
+      <w:r>
+        <w:t>4. To look up several QSOs at once, select them all in the Log Grid (Section 5.4), open Bulk Edit, and click “Lookup SKCC # for Selected.” Each QSO's own contact is looked up individually, so a mix of members and non-members in your selection is handled correctly.</w:t>
+      </w:r>
+    </w:p>
+    <w:p>
+      <w:pPr/>
+      <w:r>
+        <w:t>5. As you log a QSO with an SKCC member, a small colored circle appears next to the SKCC # field showing their award level — gold for Senator, silver for Tribune, bronze for Centurion — and a line underneath shows a quick readback of the callsign, signal report, state, name, and SKCC number you've copied, so you can double-check it before logging.</w:t>
+      </w:r>
+    </w:p>
+    <w:p>
+      <w:pPr/>
+    </w:p>
+    <w:p>
+      <w:pPr/>
+      <w:r>
+        <w:t>Scoring an SKCC event</w:t>
+      </w:r>
+    </w:p>
+    <w:p>
+      <w:pPr/>
+      <w:r>
+        <w:t>1. Open the SKCC scorer (see C.1).</w:t>
+      </w:r>
+    </w:p>
+    <w:p>
+      <w:pPr/>
+      <w:r>
+        <w:t>2. Choose which event you're scoring from the Event dropdown: Weekday Sprint, Weekend Sprintathon, Europe Sprint, Asia Sprint, or QSO Party.</w:t>
+      </w:r>
+    </w:p>
+    <w:p>
+      <w:pPr/>
+      <w:r>
+        <w:t>3. Type the event's start and end date/time (in UTC) so only QSOs from that specific event are counted. You can leave these blank to include every QSO in your log instead.</w:t>
+      </w:r>
+    </w:p>
+    <w:p>
+      <w:pPr/>
+      <w:r>
+        <w:t>4. A couple of bonus points can't be worked out automatically and need to be entered by hand: for the Weekday Sprint, if that sprint named a special “bonus station” to contact, type its callsign in the box provided; for the QSO Party, tick the box if you're submitting a photo or soapbox comment with your entry.</w:t>
+      </w:r>
+    </w:p>
+    <w:p>
+      <w:pPr/>
+      <w:r>
+        <w:t>5. Click Recalculate.</w:t>
+      </w:r>
+    </w:p>
+    <w:p>
+      <w:pPr/>
+      <w:r>
+        <w:t>6. Your score appears on the Score tab: QSO points, multipliers (unique states/provinces/countries worked), bonus points, and the final score. Click the “Multiplier &amp; Bonus Details” tab to see exactly which states/countries and which members counted toward your bonus.</w:t>
+      </w:r>
+    </w:p>
+    <w:p>
+      <w:pPr/>
+    </w:p>
+    <w:p>
+      <w:pPr/>
+      <w:r>
+        <w:t>Note: South America Sprint and Slow Speed Saunter aren't available in the scorer yet. SKCC doesn't appear to publish separate official scoring rules for these, so rather than guess at a formula, CVARC Logger simply doesn't offer them as an option.</w:t>
+      </w:r>
+    </w:p>
+    <w:p>
+      <w:pPr/>
+    </w:p>
+    <w:p>
+      <w:pPr>
+        <w:pStyle w:val="Heading2"/>
+      </w:pPr>
+      <w:r>
+        <w:t>C.8 Reading Your Results</w:t>
+      </w:r>
+    </w:p>
+    <w:p>
+      <w:pPr/>
+      <w:r>
+        <w:t>Every scorer shows the same general shape of result: how many QSOs counted, how those QSOs turned into points, any multiplier applied, bonus points added on top, and a final score at the bottom. None of these tools submit anything on your behalf — they're for checking your own score before you submit it yourself through each contest's official log-submission website.</w:t>
+      </w:r>
+    </w:p>
+    <w:p>
+      <w:pPr/>
+      <w:r>
+        <w:t>Field Day, ARRL Sweepstakes, CQ WW, Sprints, and NAQP are all labeled “Beta” in the app. That means the scoring logic has been built carefully from the official rules, but hasn't yet been checked against a large number of real, live contest logs — so treat the score as a strong estimate, and always compare against the contest's own submission site before relying on it for an important entry.</w:t>
+      </w:r>
+    </w:p>
     <w:sectPr>
+      <w:footerReference w:type="default" r:id="rId9"/>
       <w:pgSz w:w="12240" w:h="15840"/>
       <w:pgMar w:top="1440" w:right="1800" w:bottom="1440" w:left="1800" w:header="720" w:footer="720" w:gutter="0"/>
       <w:cols w:space="720"/>
@@ -5239,6 +5905,36 @@
     </w:sectPr>
   </w:body>
 </w:document>
+</file>
+
+<file path=word/footer1.xml><?xml version="1.0" encoding="utf-8"?>
+<w:ftr xmlns:m="http://schemas.openxmlformats.org/officeDocument/2006/math" xmlns:mc="http://schemas.openxmlformats.org/markup-compatibility/2006" xmlns:mo="http://schemas.microsoft.com/office/mac/office/2008/main" xmlns:mv="urn:schemas-microsoft-com:mac:vml" xmlns:o="urn:schemas-microsoft-com:office:office" xmlns:r="http://schemas.openxmlformats.org/officeDocument/2006/relationships" xmlns:v="urn:schemas-microsoft-com:vml" xmlns:w10="urn:schemas-microsoft-com:office:word" xmlns:w14="http://schemas.microsoft.com/office/word/2010/wordml" xmlns:w="http://schemas.openxmlformats.org/wordprocessingml/2006/main" xmlns:wne="http://schemas.microsoft.com/office/word/2006/wordml" xmlns:wp14="http://schemas.microsoft.com/office/word/2010/wordprocessingDrawing" xmlns:wp="http://schemas.openxmlformats.org/drawingml/2006/wordprocessingDrawing" xmlns:wpc="http://schemas.microsoft.com/office/word/2010/wordprocessingCanvas" xmlns:wpg="http://schemas.microsoft.com/office/word/2010/wordprocessingGroup" xmlns:wpi="http://schemas.microsoft.com/office/word/2010/wordprocessingInk" xmlns:wps="http://schemas.microsoft.com/office/word/2010/wordprocessingShape" mc:Ignorable="w14 wp14">
+  <w:p>
+    <w:pPr>
+      <w:pStyle w:val="Footer"/>
+      <w:jc w:val="center"/>
+    </w:pPr>
+    <w:r/>
+    <w:r>
+      <w:t xml:space="preserve">Page </w:t>
+    </w:r>
+    <w:r>
+      <w:fldChar w:fldCharType="begin"/>
+      <w:instrText xml:space="preserve">PAGE</w:instrText>
+      <w:fldChar w:fldCharType="separate"/>
+      <w:fldChar w:fldCharType="end"/>
+    </w:r>
+    <w:r>
+      <w:t xml:space="preserve"> of </w:t>
+    </w:r>
+    <w:r>
+      <w:fldChar w:fldCharType="begin"/>
+      <w:instrText xml:space="preserve">NUMPAGES</w:instrText>
+      <w:fldChar w:fldCharType="separate"/>
+      <w:fldChar w:fldCharType="end"/>
+    </w:r>
+  </w:p>
+</w:ftr>
 </file>
 
 <file path=word/numbering.xml><?xml version="1.0" encoding="utf-8"?>

</xml_diff>

<commit_message>
Bump version to 2.09, add changelog entry for manual documentation update
</commit_message>
<xml_diff>
--- a/docs/CvarcLogger User Manual.docx
+++ b/docs/CvarcLogger User Manual.docx
@@ -34,7 +34,7 @@
           <w:b/>
           <w:sz w:val="32"/>
         </w:rPr>
-        <w:t>Version 2.08 (Beta)</w:t>
+        <w:t>Version 2.09 (Beta)</w:t>
       </w:r>
     </w:p>
     <w:p>
@@ -4577,6 +4577,28 @@
           </w:tcPr>
           <w:p>
             <w:r>
+              <w:t>2.09 (Beta)</w:t>
+            </w:r>
+          </w:p>
+        </w:tc>
+        <w:tc>
+          <w:tcPr>
+            <w:tcW w:type="dxa" w:w="7920"/>
+          </w:tcPr>
+          <w:p>
+            <w:r>
+              <w:t>Documentation-only release. User manual updated: page numbers added to every page, a new Appendix C walks through every contest scoring tool step by step (Field Day, Sweepstakes, CQ WW, Sprints, NAQP, and SKCC), the version-history table's missing 2.07a/2.08 rows were added, and the title page's version stamp was corrected.</w:t>
+            </w:r>
+          </w:p>
+        </w:tc>
+      </w:tr>
+      <w:tr>
+        <w:tc>
+          <w:tcPr>
+            <w:tcW w:type="dxa" w:w="720"/>
+          </w:tcPr>
+          <w:p>
+            <w:r>
               <w:t>2.08 (Beta)</w:t>
             </w:r>
           </w:p>

</xml_diff>

<commit_message>
Revert version counter to 2.08 -- 2.09 had no code changes
The manual-only documentation update doesn't warrant its own version
number since nothing in the application changed. Folded the 2.09
changelog entry and manual version-history row back into 2.08's,
reverted AppVersion.Current to 2.08, and corrected the manual's title
page back to match.

Note: the v2.09 git tag and its NAS-archived zip/installer from the
earlier publish still exist -- flagging in case those should be
cleaned up too, since removing a tag or NAS files wasn't asked for
here.
</commit_message>
<xml_diff>
--- a/docs/CvarcLogger User Manual.docx
+++ b/docs/CvarcLogger User Manual.docx
@@ -34,7 +34,7 @@
           <w:b/>
           <w:sz w:val="32"/>
         </w:rPr>
-        <w:t>Version 2.09 (Beta)</w:t>
+        <w:t>Version 2.08 (Beta)</w:t>
       </w:r>
     </w:p>
     <w:p>
@@ -4577,28 +4577,6 @@
           </w:tcPr>
           <w:p>
             <w:r>
-              <w:t>2.09 (Beta)</w:t>
-            </w:r>
-          </w:p>
-        </w:tc>
-        <w:tc>
-          <w:tcPr>
-            <w:tcW w:type="dxa" w:w="7920"/>
-          </w:tcPr>
-          <w:p>
-            <w:r>
-              <w:t>Documentation-only release. User manual updated: page numbers added to every page, a new Appendix C walks through every contest scoring tool step by step (Field Day, Sweepstakes, CQ WW, Sprints, NAQP, and SKCC), the version-history table's missing 2.07a/2.08 rows were added, and the title page's version stamp was corrected.</w:t>
-            </w:r>
-          </w:p>
-        </w:tc>
-      </w:tr>
-      <w:tr>
-        <w:tc>
-          <w:tcPr>
-            <w:tcW w:type="dxa" w:w="720"/>
-          </w:tcPr>
-          <w:p>
-            <w:r>
               <w:t>2.08 (Beta)</w:t>
             </w:r>
           </w:p>

</xml_diff>